<commit_message>
set up JUnit and made tests
</commit_message>
<xml_diff>
--- a/mm/KI-bruk.docx
+++ b/mm/KI-bruk.docx
@@ -124,6 +124,26 @@
           <w:lang w:val="nb-NO"/>
         </w:rPr>
       </w:pPr>
+      <w:r>
+        <w:rPr>
+          <w:lang w:val="nb-NO"/>
+        </w:rPr>
+        <w:t xml:space="preserve">Brukte KI for å sette opp </w:t>
+      </w:r>
+      <w:proofErr w:type="spellStart"/>
+      <w:r>
+        <w:rPr>
+          <w:lang w:val="nb-NO"/>
+        </w:rPr>
+        <w:t>JUnit</w:t>
+      </w:r>
+      <w:proofErr w:type="spellEnd"/>
+      <w:r>
+        <w:rPr>
+          <w:lang w:val="nb-NO"/>
+        </w:rPr>
+        <w:t xml:space="preserve"> i pom-filen.</w:t>
+      </w:r>
     </w:p>
     <w:sectPr>
       <w:pgSz w:w="11906" w:h="16838"/>

</xml_diff>